<commit_message>
fix: struck-through rows are out of scope; wrapped stub labels keep spaces
Two structural defects from the real-world shells. A stub row struck
through in Word is a row the author deleted -- parsing it as live
re-added a dropped analysis; it is now skipped with an INFO diagnostic
naming it. A partially struck cell (value crossed out and retyped) stays
live.

Separately, .cell_text() concatenated every text run of a cell with no
separator, so a label that WRAPPED in Word came back fused
('dataextraction') and two levels authored as separate paragraphs welded
into one line. Paragraphs now join with a space; runs still join bare.

Fixture gains a struck row and a two-paragraph stub cell, both authored
by OOXML post-processing since officer cannot write them directly.

Phase R2 of HANDOFF_realworld_bracket_shells.

Co-Authored-By: Claude Fable 5 <noreply@anthropic.com>
</commit_message>
<xml_diff>
--- a/tests/testthat/fixtures/annotated_shell_rwb_bracket.docx
+++ b/tests/testthat/fixtures/annotated_shell_rwb_bracket.docx
@@ -341,6 +341,118 @@
             </w:pPr>
             <w:r>
               <w:t>... [Repeat the applicable row or section using this ordered instruction: Repeat for ADCM.MEDPRES IN ("DrugA", "DrugB") WHERE ADCM.ONMEDFL="Y". Expand all repeated items before final programming.]</w:t>
+            </w:r>
+          </w:p>
+        </w:tc>
+        <w:tc>
+          <w:p>
+            <w:pPr>
+              <w:pStyle w:val="Normal"/>
+            </w:pPr>
+            <w:r>
+              <w:t>xx (xx.x)</w:t>
+            </w:r>
+          </w:p>
+        </w:tc>
+        <w:tc>
+          <w:p>
+            <w:pPr>
+              <w:pStyle w:val="Normal"/>
+            </w:pPr>
+            <w:r>
+              <w:t>xx (xx.x)</w:t>
+            </w:r>
+          </w:p>
+        </w:tc>
+        <w:tc>
+          <w:p>
+            <w:pPr>
+              <w:pStyle w:val="Normal"/>
+            </w:pPr>
+            <w:r>
+              <w:t>xx (xx.x)</w:t>
+            </w:r>
+          </w:p>
+        </w:tc>
+        <w:tc>
+          <w:p>
+            <w:pPr>
+              <w:pStyle w:val="Normal"/>
+            </w:pPr>
+            <w:r>
+              <w:t>xx (xx.x)</w:t>
+            </w:r>
+          </w:p>
+        </w:tc>
+      </w:tr>
+      <w:tr>
+        <w:tc>
+          <w:p>
+            <w:pPr>
+              <w:pStyle w:val="Normal"/>
+            </w:pPr>
+            <w:r>
+              <w:rPr xmlns:w="http://schemas.openxmlformats.org/wordprocessingml/2006/main">
+                <w:strike/>
+              </w:rPr>
+              <w:t>Subjects rescreened, n [ADSL.RESCRFL='Y']</w:t>
+            </w:r>
+          </w:p>
+        </w:tc>
+        <w:tc>
+          <w:p>
+            <w:pPr>
+              <w:pStyle w:val="Normal"/>
+            </w:pPr>
+            <w:r>
+              <w:t>xx (xx.x)</w:t>
+            </w:r>
+          </w:p>
+        </w:tc>
+        <w:tc>
+          <w:p>
+            <w:pPr>
+              <w:pStyle w:val="Normal"/>
+            </w:pPr>
+            <w:r>
+              <w:t>xx (xx.x)</w:t>
+            </w:r>
+          </w:p>
+        </w:tc>
+        <w:tc>
+          <w:p>
+            <w:pPr>
+              <w:pStyle w:val="Normal"/>
+            </w:pPr>
+            <w:r>
+              <w:t>xx (xx.x)</w:t>
+            </w:r>
+          </w:p>
+        </w:tc>
+        <w:tc>
+          <w:p>
+            <w:pPr>
+              <w:pStyle w:val="Normal"/>
+            </w:pPr>
+            <w:r>
+              <w:t>xx (xx.x)</w:t>
+            </w:r>
+          </w:p>
+        </w:tc>
+      </w:tr>
+      <w:tr>
+        <w:tc>
+          <w:p>
+            <w:pPr>
+              <w:pStyle w:val="Normal"/>
+            </w:pPr>
+            <w:r xmlns:w="http://schemas.openxmlformats.org/wordprocessingml/2006/main">
+              <w:t xml:space="preserve">Ongoing subjects at the time of the data</w:t>
+            </w:r>
+          </w:p>
+          <w:p xmlns:w="http://schemas.openxmlformats.org/wordprocessingml/2006/main">
+            <w:r>
+              <w:t xml:space="preserve">extraction, n (%) [ADSL.EOSSTT='ONGOING']</w:t>
             </w:r>
           </w:p>
         </w:tc>

</xml_diff>